<commit_message>
docs: add team members to the project report and deck
</commit_message>
<xml_diff>
--- a/docs/ShaderMesh-Project-Report.docx
+++ b/docs/ShaderMesh-Project-Report.docx
@@ -135,7 +135,7 @@
               <w:spacing w:before="40" w:after="40" w:line="276" w:lineRule="auto"/>
             </w:pPr>
             <w:r>
-              <w:t>[MEMBER 2 NAME]</w:t>
+              <w:t>Nilam Sikdar</w:t>
             </w:r>
           </w:p>
         </w:tc>
@@ -148,7 +148,7 @@
               <w:spacing w:before="40" w:after="40" w:line="276" w:lineRule="auto"/>
             </w:pPr>
             <w:r>
-              <w:t>[MEMBER 2 REG. NO.]</w:t>
+              <w:t>24BCC7025</w:t>
             </w:r>
           </w:p>
         </w:tc>
@@ -166,7 +166,7 @@
               <w:spacing w:before="40" w:after="40" w:line="276" w:lineRule="auto"/>
             </w:pPr>
             <w:r>
-              <w:t>[MEMBER 3 NAME]</w:t>
+              <w:t>Animesh Mishra</w:t>
             </w:r>
           </w:p>
         </w:tc>
@@ -179,7 +179,7 @@
               <w:spacing w:before="40" w:after="40" w:line="276" w:lineRule="auto"/>
             </w:pPr>
             <w:r>
-              <w:t>[MEMBER 3 REG. NO.]</w:t>
+              <w:t>24BCC7016</w:t>
             </w:r>
           </w:p>
         </w:tc>
@@ -207,7 +207,7 @@
           <w:noProof/>
         </w:rPr>
         <w:drawing>
-          <wp:inline distT="0" distB="0" distL="0" distR="0" wp14:anchorId="6612021F" wp14:editId="5BE85B0B">
+          <wp:inline distT="0" distB="0" distL="0" distR="0" wp14:anchorId="5DCBD8AA" wp14:editId="7043CA9F">
             <wp:extent cx="2160000" cy="667349"/>
             <wp:effectExtent l="0" t="0" r="0" b="0"/>
             <wp:docPr id="1" name="Picture 1"/>
@@ -318,7 +318,7 @@
       <w:r>
         <w:fldChar w:fldCharType="separate"/>
       </w:r>
-      <w:hyperlink w:anchor="_Toc243754727" w:history="1">
+      <w:hyperlink w:anchor="_Toc244039472" w:history="1">
         <w:r>
           <w:rPr>
             <w:rStyle w:val="Hyperlink"/>
@@ -345,7 +345,7 @@
             <w:noProof/>
             <w:webHidden/>
           </w:rPr>
-          <w:instrText xml:space="preserve"> PAGEREF _Toc243754727 \h </w:instrText>
+          <w:instrText xml:space="preserve"> PAGEREF _Toc244039472 \h </w:instrText>
         </w:r>
         <w:r>
           <w:rPr>
@@ -390,7 +390,7 @@
           <w14:ligatures w14:val="standardContextual"/>
         </w:rPr>
       </w:pPr>
-      <w:hyperlink w:anchor="_Toc243754728" w:history="1">
+      <w:hyperlink w:anchor="_Toc244039473" w:history="1">
         <w:r>
           <w:rPr>
             <w:rStyle w:val="Hyperlink"/>
@@ -417,7 +417,7 @@
             <w:noProof/>
             <w:webHidden/>
           </w:rPr>
-          <w:instrText xml:space="preserve"> PAGEREF _Toc243754728 \h </w:instrText>
+          <w:instrText xml:space="preserve"> PAGEREF _Toc244039473 \h </w:instrText>
         </w:r>
         <w:r>
           <w:rPr>
@@ -462,7 +462,7 @@
           <w14:ligatures w14:val="standardContextual"/>
         </w:rPr>
       </w:pPr>
-      <w:hyperlink w:anchor="_Toc243754729" w:history="1">
+      <w:hyperlink w:anchor="_Toc244039474" w:history="1">
         <w:r>
           <w:rPr>
             <w:rStyle w:val="Hyperlink"/>
@@ -489,7 +489,7 @@
             <w:noProof/>
             <w:webHidden/>
           </w:rPr>
-          <w:instrText xml:space="preserve"> PAGEREF _Toc243754729 \h </w:instrText>
+          <w:instrText xml:space="preserve"> PAGEREF _Toc244039474 \h </w:instrText>
         </w:r>
         <w:r>
           <w:rPr>
@@ -534,7 +534,7 @@
           <w14:ligatures w14:val="standardContextual"/>
         </w:rPr>
       </w:pPr>
-      <w:hyperlink w:anchor="_Toc243754730" w:history="1">
+      <w:hyperlink w:anchor="_Toc244039475" w:history="1">
         <w:r>
           <w:rPr>
             <w:rStyle w:val="Hyperlink"/>
@@ -561,7 +561,7 @@
             <w:noProof/>
             <w:webHidden/>
           </w:rPr>
-          <w:instrText xml:space="preserve"> PAGEREF _Toc243754730 \h </w:instrText>
+          <w:instrText xml:space="preserve"> PAGEREF _Toc244039475 \h </w:instrText>
         </w:r>
         <w:r>
           <w:rPr>
@@ -606,7 +606,7 @@
           <w14:ligatures w14:val="standardContextual"/>
         </w:rPr>
       </w:pPr>
-      <w:hyperlink w:anchor="_Toc243754731" w:history="1">
+      <w:hyperlink w:anchor="_Toc244039476" w:history="1">
         <w:r>
           <w:rPr>
             <w:rStyle w:val="Hyperlink"/>
@@ -633,7 +633,7 @@
             <w:noProof/>
             <w:webHidden/>
           </w:rPr>
-          <w:instrText xml:space="preserve"> PAGEREF _Toc243754731 \h </w:instrText>
+          <w:instrText xml:space="preserve"> PAGEREF _Toc244039476 \h </w:instrText>
         </w:r>
         <w:r>
           <w:rPr>
@@ -678,7 +678,7 @@
           <w14:ligatures w14:val="standardContextual"/>
         </w:rPr>
       </w:pPr>
-      <w:hyperlink w:anchor="_Toc243754732" w:history="1">
+      <w:hyperlink w:anchor="_Toc244039477" w:history="1">
         <w:r>
           <w:rPr>
             <w:rStyle w:val="Hyperlink"/>
@@ -705,7 +705,7 @@
             <w:noProof/>
             <w:webHidden/>
           </w:rPr>
-          <w:instrText xml:space="preserve"> PAGEREF _Toc243754732 \h </w:instrText>
+          <w:instrText xml:space="preserve"> PAGEREF _Toc244039477 \h </w:instrText>
         </w:r>
         <w:r>
           <w:rPr>
@@ -750,7 +750,7 @@
           <w14:ligatures w14:val="standardContextual"/>
         </w:rPr>
       </w:pPr>
-      <w:hyperlink w:anchor="_Toc243754733" w:history="1">
+      <w:hyperlink w:anchor="_Toc244039478" w:history="1">
         <w:r>
           <w:rPr>
             <w:rStyle w:val="Hyperlink"/>
@@ -777,7 +777,7 @@
             <w:noProof/>
             <w:webHidden/>
           </w:rPr>
-          <w:instrText xml:space="preserve"> PAGEREF _Toc243754733 \h </w:instrText>
+          <w:instrText xml:space="preserve"> PAGEREF _Toc244039478 \h </w:instrText>
         </w:r>
         <w:r>
           <w:rPr>
@@ -822,7 +822,7 @@
           <w14:ligatures w14:val="standardContextual"/>
         </w:rPr>
       </w:pPr>
-      <w:hyperlink w:anchor="_Toc243754734" w:history="1">
+      <w:hyperlink w:anchor="_Toc244039479" w:history="1">
         <w:r>
           <w:rPr>
             <w:rStyle w:val="Hyperlink"/>
@@ -849,7 +849,7 @@
             <w:noProof/>
             <w:webHidden/>
           </w:rPr>
-          <w:instrText xml:space="preserve"> PAGEREF _Toc243754734 \h </w:instrText>
+          <w:instrText xml:space="preserve"> PAGEREF _Toc244039479 \h </w:instrText>
         </w:r>
         <w:r>
           <w:rPr>
@@ -894,7 +894,7 @@
           <w14:ligatures w14:val="standardContextual"/>
         </w:rPr>
       </w:pPr>
-      <w:hyperlink w:anchor="_Toc243754735" w:history="1">
+      <w:hyperlink w:anchor="_Toc244039480" w:history="1">
         <w:r>
           <w:rPr>
             <w:rStyle w:val="Hyperlink"/>
@@ -921,7 +921,7 @@
             <w:noProof/>
             <w:webHidden/>
           </w:rPr>
-          <w:instrText xml:space="preserve"> PAGEREF _Toc243754735 \h </w:instrText>
+          <w:instrText xml:space="preserve"> PAGEREF _Toc244039480 \h </w:instrText>
         </w:r>
         <w:r>
           <w:rPr>
@@ -966,7 +966,7 @@
           <w14:ligatures w14:val="standardContextual"/>
         </w:rPr>
       </w:pPr>
-      <w:hyperlink w:anchor="_Toc243754736" w:history="1">
+      <w:hyperlink w:anchor="_Toc244039481" w:history="1">
         <w:r>
           <w:rPr>
             <w:rStyle w:val="Hyperlink"/>
@@ -993,7 +993,7 @@
             <w:noProof/>
             <w:webHidden/>
           </w:rPr>
-          <w:instrText xml:space="preserve"> PAGEREF _Toc243754736 \h </w:instrText>
+          <w:instrText xml:space="preserve"> PAGEREF _Toc244039481 \h </w:instrText>
         </w:r>
         <w:r>
           <w:rPr>
@@ -1038,7 +1038,7 @@
           <w14:ligatures w14:val="standardContextual"/>
         </w:rPr>
       </w:pPr>
-      <w:hyperlink w:anchor="_Toc243754737" w:history="1">
+      <w:hyperlink w:anchor="_Toc244039482" w:history="1">
         <w:r>
           <w:rPr>
             <w:rStyle w:val="Hyperlink"/>
@@ -1065,7 +1065,7 @@
             <w:noProof/>
             <w:webHidden/>
           </w:rPr>
-          <w:instrText xml:space="preserve"> PAGEREF _Toc243754737 \h </w:instrText>
+          <w:instrText xml:space="preserve"> PAGEREF _Toc244039482 \h </w:instrText>
         </w:r>
         <w:r>
           <w:rPr>
@@ -1110,7 +1110,7 @@
           <w14:ligatures w14:val="standardContextual"/>
         </w:rPr>
       </w:pPr>
-      <w:hyperlink w:anchor="_Toc243754738" w:history="1">
+      <w:hyperlink w:anchor="_Toc244039483" w:history="1">
         <w:r>
           <w:rPr>
             <w:rStyle w:val="Hyperlink"/>
@@ -1137,7 +1137,7 @@
             <w:noProof/>
             <w:webHidden/>
           </w:rPr>
-          <w:instrText xml:space="preserve"> PAGEREF _Toc243754738 \h </w:instrText>
+          <w:instrText xml:space="preserve"> PAGEREF _Toc244039483 \h </w:instrText>
         </w:r>
         <w:r>
           <w:rPr>
@@ -1182,7 +1182,7 @@
           <w14:ligatures w14:val="standardContextual"/>
         </w:rPr>
       </w:pPr>
-      <w:hyperlink w:anchor="_Toc243754739" w:history="1">
+      <w:hyperlink w:anchor="_Toc244039484" w:history="1">
         <w:r>
           <w:rPr>
             <w:rStyle w:val="Hyperlink"/>
@@ -1209,7 +1209,7 @@
             <w:noProof/>
             <w:webHidden/>
           </w:rPr>
-          <w:instrText xml:space="preserve"> PAGEREF _Toc243754739 \h </w:instrText>
+          <w:instrText xml:space="preserve"> PAGEREF _Toc244039484 \h </w:instrText>
         </w:r>
         <w:r>
           <w:rPr>
@@ -1254,7 +1254,7 @@
           <w14:ligatures w14:val="standardContextual"/>
         </w:rPr>
       </w:pPr>
-      <w:hyperlink w:anchor="_Toc243754740" w:history="1">
+      <w:hyperlink w:anchor="_Toc244039485" w:history="1">
         <w:r>
           <w:rPr>
             <w:rStyle w:val="Hyperlink"/>
@@ -1281,7 +1281,7 @@
             <w:noProof/>
             <w:webHidden/>
           </w:rPr>
-          <w:instrText xml:space="preserve"> PAGEREF _Toc243754740 \h </w:instrText>
+          <w:instrText xml:space="preserve"> PAGEREF _Toc244039485 \h </w:instrText>
         </w:r>
         <w:r>
           <w:rPr>
@@ -1326,7 +1326,7 @@
           <w14:ligatures w14:val="standardContextual"/>
         </w:rPr>
       </w:pPr>
-      <w:hyperlink w:anchor="_Toc243754741" w:history="1">
+      <w:hyperlink w:anchor="_Toc244039486" w:history="1">
         <w:r>
           <w:rPr>
             <w:rStyle w:val="Hyperlink"/>
@@ -1353,7 +1353,7 @@
             <w:noProof/>
             <w:webHidden/>
           </w:rPr>
-          <w:instrText xml:space="preserve"> PAGEREF _Toc243754741 \h </w:instrText>
+          <w:instrText xml:space="preserve"> PAGEREF _Toc244039486 \h </w:instrText>
         </w:r>
         <w:r>
           <w:rPr>
@@ -1398,7 +1398,7 @@
           <w14:ligatures w14:val="standardContextual"/>
         </w:rPr>
       </w:pPr>
-      <w:hyperlink w:anchor="_Toc243754742" w:history="1">
+      <w:hyperlink w:anchor="_Toc244039487" w:history="1">
         <w:r>
           <w:rPr>
             <w:rStyle w:val="Hyperlink"/>
@@ -1425,7 +1425,7 @@
             <w:noProof/>
             <w:webHidden/>
           </w:rPr>
-          <w:instrText xml:space="preserve"> PAGEREF _Toc243754742 \h </w:instrText>
+          <w:instrText xml:space="preserve"> PAGEREF _Toc244039487 \h </w:instrText>
         </w:r>
         <w:r>
           <w:rPr>
@@ -1469,7 +1469,7 @@
         <w:pStyle w:val="Heading1"/>
         <w:pageBreakBefore/>
       </w:pPr>
-      <w:bookmarkStart w:id="0" w:name="_Toc243754727"/>
+      <w:bookmarkStart w:id="0" w:name="_Toc244039472"/>
       <w:r>
         <w:lastRenderedPageBreak/>
         <w:t>1. PROJECT TITLE</w:t>
@@ -1501,7 +1501,7 @@
       <w:pPr>
         <w:pStyle w:val="Heading1"/>
       </w:pPr>
-      <w:bookmarkStart w:id="1" w:name="_Toc243754728"/>
+      <w:bookmarkStart w:id="1" w:name="_Toc244039473"/>
       <w:r>
         <w:t>2. TEAM MEMBERS AND ROLL NUMBERS</w:t>
       </w:r>
@@ -1696,7 +1696,7 @@
               <w:rPr>
                 <w:sz w:val="21"/>
               </w:rPr>
-              <w:t>[MEMBER 2 NAME]</w:t>
+              <w:t>Nilam Sikdar</w:t>
             </w:r>
           </w:p>
         </w:tc>
@@ -1713,7 +1713,7 @@
               <w:rPr>
                 <w:sz w:val="21"/>
               </w:rPr>
-              <w:t>[MEMBER 2 REG. NO.]</w:t>
+              <w:t>24BCC7025</w:t>
             </w:r>
           </w:p>
         </w:tc>
@@ -1751,7 +1751,7 @@
               <w:rPr>
                 <w:sz w:val="21"/>
               </w:rPr>
-              <w:t>[MEMBER 3 NAME]</w:t>
+              <w:t>Animesh Mishra</w:t>
             </w:r>
           </w:p>
         </w:tc>
@@ -1767,7 +1767,7 @@
               <w:rPr>
                 <w:sz w:val="21"/>
               </w:rPr>
-              <w:t>[MEMBER 3 REG. NO.]</w:t>
+              <w:t>24BCC7016</w:t>
             </w:r>
           </w:p>
         </w:tc>
@@ -1792,7 +1792,7 @@
       <w:pPr>
         <w:pStyle w:val="Heading1"/>
       </w:pPr>
-      <w:bookmarkStart w:id="2" w:name="_Toc243754729"/>
+      <w:bookmarkStart w:id="2" w:name="_Toc244039474"/>
       <w:r>
         <w:t>3. PROBLEM STATEMENT</w:t>
       </w:r>
@@ -1911,7 +1911,7 @@
           <w:noProof/>
         </w:rPr>
         <w:drawing>
-          <wp:inline distT="0" distB="0" distL="0" distR="0" wp14:anchorId="7BF99187" wp14:editId="3050F4C2">
+          <wp:inline distT="0" distB="0" distL="0" distR="0" wp14:anchorId="73C11FEF" wp14:editId="52F2FC80">
             <wp:extent cx="5220000" cy="1706940"/>
             <wp:effectExtent l="0" t="0" r="0" b="0"/>
             <wp:docPr id="2" name="Picture 2"/>
@@ -2078,7 +2078,7 @@
       <w:pPr>
         <w:pStyle w:val="Heading1"/>
       </w:pPr>
-      <w:bookmarkStart w:id="3" w:name="_Toc243754730"/>
+      <w:bookmarkStart w:id="3" w:name="_Toc244039475"/>
       <w:r>
         <w:t>4. OBJECTIVES</w:t>
       </w:r>
@@ -2180,7 +2180,7 @@
       <w:pPr>
         <w:pStyle w:val="Heading1"/>
       </w:pPr>
-      <w:bookmarkStart w:id="4" w:name="_Toc243754731"/>
+      <w:bookmarkStart w:id="4" w:name="_Toc244039476"/>
       <w:r>
         <w:t>5. MOTIVATION AND NEED FOR THE PROJECT</w:t>
       </w:r>
@@ -2290,7 +2290,7 @@
       <w:pPr>
         <w:pStyle w:val="Heading1"/>
       </w:pPr>
-      <w:bookmarkStart w:id="5" w:name="_Toc243754732"/>
+      <w:bookmarkStart w:id="5" w:name="_Toc244039477"/>
       <w:r>
         <w:t>6. LITERATURE SURVEY</w:t>
       </w:r>
@@ -3077,7 +3077,7 @@
       <w:pPr>
         <w:pStyle w:val="Heading1"/>
       </w:pPr>
-      <w:bookmarkStart w:id="6" w:name="_Toc243754733"/>
+      <w:bookmarkStart w:id="6" w:name="_Toc244039478"/>
       <w:r>
         <w:t>7. EXISTING SYSTEM</w:t>
       </w:r>
@@ -3434,7 +3434,7 @@
       <w:pPr>
         <w:pStyle w:val="Heading1"/>
       </w:pPr>
-      <w:bookmarkStart w:id="7" w:name="_Toc243754734"/>
+      <w:bookmarkStart w:id="7" w:name="_Toc244039479"/>
       <w:r>
         <w:t>8. PROPOSED SYSTEM</w:t>
       </w:r>
@@ -3562,7 +3562,7 @@
           <w:noProof/>
         </w:rPr>
         <w:drawing>
-          <wp:inline distT="0" distB="0" distL="0" distR="0" wp14:anchorId="2CCA951D" wp14:editId="72C73CD1">
+          <wp:inline distT="0" distB="0" distL="0" distR="0" wp14:anchorId="4ECD8AE6" wp14:editId="3E566F93">
             <wp:extent cx="4731428" cy="2879074"/>
             <wp:effectExtent l="0" t="0" r="0" b="0"/>
             <wp:docPr id="3" name="Picture 3"/>
@@ -3727,7 +3727,7 @@
       <w:pPr>
         <w:pStyle w:val="Heading1"/>
       </w:pPr>
-      <w:bookmarkStart w:id="8" w:name="_Toc243754735"/>
+      <w:bookmarkStart w:id="8" w:name="_Toc244039480"/>
       <w:r>
         <w:t>9. BLOCKCHAIN CONCEPTS USED</w:t>
       </w:r>
@@ -4449,7 +4449,7 @@
       <w:pPr>
         <w:pStyle w:val="Heading1"/>
       </w:pPr>
-      <w:bookmarkStart w:id="9" w:name="_Toc243754736"/>
+      <w:bookmarkStart w:id="9" w:name="_Toc244039481"/>
       <w:r>
         <w:t>10. SYSTEM ARCHITECTURE AND BLOCK DIAGRAM</w:t>
       </w:r>
@@ -4475,7 +4475,7 @@
           <w:noProof/>
         </w:rPr>
         <w:drawing>
-          <wp:inline distT="0" distB="0" distL="0" distR="0" wp14:anchorId="60752279" wp14:editId="08B8623D">
+          <wp:inline distT="0" distB="0" distL="0" distR="0" wp14:anchorId="150321F6" wp14:editId="343A9FC0">
             <wp:extent cx="5220000" cy="3593970"/>
             <wp:effectExtent l="0" t="0" r="0" b="0"/>
             <wp:docPr id="4" name="Picture 4"/>
@@ -4542,7 +4542,7 @@
         </w:rPr>
         <w:lastRenderedPageBreak/>
         <w:drawing>
-          <wp:inline distT="0" distB="0" distL="0" distR="0" wp14:anchorId="249D6F51" wp14:editId="46C42FE5">
+          <wp:inline distT="0" distB="0" distL="0" distR="0" wp14:anchorId="480F6A3B" wp14:editId="126B3F57">
             <wp:extent cx="5220000" cy="3043260"/>
             <wp:effectExtent l="0" t="0" r="0" b="0"/>
             <wp:docPr id="5" name="Picture 5"/>
@@ -4592,7 +4592,7 @@
       <w:pPr>
         <w:pStyle w:val="Heading1"/>
       </w:pPr>
-      <w:bookmarkStart w:id="10" w:name="_Toc243754737"/>
+      <w:bookmarkStart w:id="10" w:name="_Toc244039482"/>
       <w:r>
         <w:t>11. MODULES</w:t>
       </w:r>
@@ -4618,7 +4618,7 @@
           <w:noProof/>
         </w:rPr>
         <w:drawing>
-          <wp:inline distT="0" distB="0" distL="0" distR="0" wp14:anchorId="6F6E4A3E" wp14:editId="7523157F">
+          <wp:inline distT="0" distB="0" distL="0" distR="0" wp14:anchorId="3769A148" wp14:editId="6A5D153B">
             <wp:extent cx="5220000" cy="2275920"/>
             <wp:effectExtent l="0" t="0" r="0" b="0"/>
             <wp:docPr id="6" name="Picture 6"/>
@@ -4955,7 +4955,7 @@
         </w:rPr>
         <w:lastRenderedPageBreak/>
         <w:drawing>
-          <wp:inline distT="0" distB="0" distL="0" distR="0" wp14:anchorId="5DFC9568" wp14:editId="3DFCA2C1">
+          <wp:inline distT="0" distB="0" distL="0" distR="0" wp14:anchorId="10045C9E" wp14:editId="1261C742">
             <wp:extent cx="4896000" cy="3060000"/>
             <wp:effectExtent l="0" t="0" r="0" b="0"/>
             <wp:docPr id="7" name="Picture 7"/>
@@ -5012,7 +5012,7 @@
           <w:noProof/>
         </w:rPr>
         <w:drawing>
-          <wp:inline distT="0" distB="0" distL="0" distR="0" wp14:anchorId="1FFC9624" wp14:editId="38189641">
+          <wp:inline distT="0" distB="0" distL="0" distR="0" wp14:anchorId="4C25E8BF" wp14:editId="655EC2F2">
             <wp:extent cx="4896000" cy="3060000"/>
             <wp:effectExtent l="0" t="0" r="0" b="0"/>
             <wp:docPr id="8" name="Picture 8"/>
@@ -5062,7 +5062,7 @@
       <w:pPr>
         <w:pStyle w:val="Heading1"/>
       </w:pPr>
-      <w:bookmarkStart w:id="11" w:name="_Toc243754738"/>
+      <w:bookmarkStart w:id="11" w:name="_Toc244039483"/>
       <w:r>
         <w:t>12. TECHNOLOGY STACK</w:t>
       </w:r>
@@ -5089,7 +5089,7 @@
         </w:rPr>
         <w:lastRenderedPageBreak/>
         <w:drawing>
-          <wp:inline distT="0" distB="0" distL="0" distR="0" wp14:anchorId="224917C7" wp14:editId="6921F0CD">
+          <wp:inline distT="0" distB="0" distL="0" distR="0" wp14:anchorId="7F69BCC4" wp14:editId="167B98E7">
             <wp:extent cx="5220000" cy="2088000"/>
             <wp:effectExtent l="0" t="0" r="0" b="0"/>
             <wp:docPr id="9" name="Picture 9"/>
@@ -5492,7 +5492,7 @@
       <w:pPr>
         <w:pStyle w:val="Heading1"/>
       </w:pPr>
-      <w:bookmarkStart w:id="12" w:name="_Toc243754739"/>
+      <w:bookmarkStart w:id="12" w:name="_Toc244039484"/>
       <w:r>
         <w:t>13. METHODOLOGY AND WORKFLOW</w:t>
       </w:r>
@@ -5527,7 +5527,7 @@
         </w:rPr>
         <w:lastRenderedPageBreak/>
         <w:drawing>
-          <wp:inline distT="0" distB="0" distL="0" distR="0" wp14:anchorId="561FDB90" wp14:editId="1F36FD27">
+          <wp:inline distT="0" distB="0" distL="0" distR="0" wp14:anchorId="1EA58666" wp14:editId="4F21BE89">
             <wp:extent cx="5220000" cy="1242360"/>
             <wp:effectExtent l="0" t="0" r="0" b="0"/>
             <wp:docPr id="10" name="Picture 10"/>
@@ -5708,7 +5708,7 @@
         </w:rPr>
         <w:lastRenderedPageBreak/>
         <w:drawing>
-          <wp:inline distT="0" distB="0" distL="0" distR="0" wp14:anchorId="1B9A92D8" wp14:editId="14001B7F">
+          <wp:inline distT="0" distB="0" distL="0" distR="0" wp14:anchorId="5C97728C" wp14:editId="39124A76">
             <wp:extent cx="4101428" cy="3959929"/>
             <wp:effectExtent l="0" t="0" r="0" b="0"/>
             <wp:docPr id="11" name="Picture 11"/>
@@ -5782,7 +5782,7 @@
           <w:noProof/>
         </w:rPr>
         <w:drawing>
-          <wp:inline distT="0" distB="0" distL="0" distR="0" wp14:anchorId="632BA55C" wp14:editId="1C73AC8A">
+          <wp:inline distT="0" distB="0" distL="0" distR="0" wp14:anchorId="0DBF7666" wp14:editId="052DDF41">
             <wp:extent cx="5165999" cy="2518425"/>
             <wp:effectExtent l="0" t="0" r="0" b="0"/>
             <wp:docPr id="12" name="Picture 12"/>
@@ -5832,7 +5832,7 @@
       <w:pPr>
         <w:pStyle w:val="Heading1"/>
       </w:pPr>
-      <w:bookmarkStart w:id="13" w:name="_Toc243754740"/>
+      <w:bookmarkStart w:id="13" w:name="_Toc244039485"/>
       <w:r>
         <w:lastRenderedPageBreak/>
         <w:t>14. DATASET AND INPUT DETAILS</w:t>
@@ -6286,7 +6286,7 @@
       <w:pPr>
         <w:pStyle w:val="Heading1"/>
       </w:pPr>
-      <w:bookmarkStart w:id="14" w:name="_Toc243754741"/>
+      <w:bookmarkStart w:id="14" w:name="_Toc244039486"/>
       <w:r>
         <w:t>15. EXPECTED OUTCOMES</w:t>
       </w:r>
@@ -7127,7 +7127,7 @@
           <w:noProof/>
         </w:rPr>
         <w:drawing>
-          <wp:inline distT="0" distB="0" distL="0" distR="0" wp14:anchorId="1CAEF61D" wp14:editId="7F24710D">
+          <wp:inline distT="0" distB="0" distL="0" distR="0" wp14:anchorId="4BDA7CEE" wp14:editId="17F798C5">
             <wp:extent cx="5120689" cy="2698603"/>
             <wp:effectExtent l="0" t="0" r="0" b="0"/>
             <wp:docPr id="13" name="Picture 13"/>
@@ -7186,7 +7186,7 @@
       <w:pPr>
         <w:pStyle w:val="Heading1"/>
       </w:pPr>
-      <w:bookmarkStart w:id="15" w:name="_Toc243754742"/>
+      <w:bookmarkStart w:id="15" w:name="_Toc244039487"/>
       <w:r>
         <w:lastRenderedPageBreak/>
         <w:t>16. REFERENCES</w:t>
@@ -8025,31 +8025,31 @@
       </w:rPr>
     </w:lvl>
   </w:abstractNum>
-  <w:num w:numId="1" w16cid:durableId="1642342789">
+  <w:num w:numId="1" w16cid:durableId="1804807557">
     <w:abstractNumId w:val="8"/>
   </w:num>
-  <w:num w:numId="2" w16cid:durableId="1643542220">
+  <w:num w:numId="2" w16cid:durableId="275910081">
     <w:abstractNumId w:val="6"/>
   </w:num>
-  <w:num w:numId="3" w16cid:durableId="489441605">
+  <w:num w:numId="3" w16cid:durableId="1135877647">
     <w:abstractNumId w:val="5"/>
   </w:num>
-  <w:num w:numId="4" w16cid:durableId="684862359">
+  <w:num w:numId="4" w16cid:durableId="1323892863">
     <w:abstractNumId w:val="4"/>
   </w:num>
-  <w:num w:numId="5" w16cid:durableId="1686319840">
+  <w:num w:numId="5" w16cid:durableId="1704591452">
     <w:abstractNumId w:val="7"/>
   </w:num>
-  <w:num w:numId="6" w16cid:durableId="1991133902">
+  <w:num w:numId="6" w16cid:durableId="131212181">
     <w:abstractNumId w:val="3"/>
   </w:num>
-  <w:num w:numId="7" w16cid:durableId="2060132170">
+  <w:num w:numId="7" w16cid:durableId="930312065">
     <w:abstractNumId w:val="2"/>
   </w:num>
-  <w:num w:numId="8" w16cid:durableId="1414082517">
+  <w:num w:numId="8" w16cid:durableId="2059278671">
     <w:abstractNumId w:val="1"/>
   </w:num>
-  <w:num w:numId="9" w16cid:durableId="495263478">
+  <w:num w:numId="9" w16cid:durableId="1847288587">
     <w:abstractNumId w:val="0"/>
   </w:num>
 </w:numbering>
@@ -19462,7 +19462,7 @@
     <w:autoRedefine/>
     <w:uiPriority w:val="39"/>
     <w:unhideWhenUsed/>
-    <w:rsid w:val="00D22807"/>
+    <w:rsid w:val="007D0309"/>
     <w:pPr>
       <w:spacing w:after="100"/>
     </w:pPr>
@@ -19472,7 +19472,7 @@
     <w:basedOn w:val="DefaultParagraphFont"/>
     <w:uiPriority w:val="99"/>
     <w:unhideWhenUsed/>
-    <w:rsid w:val="00D22807"/>
+    <w:rsid w:val="007D0309"/>
     <w:rPr>
       <w:color w:val="0000FF" w:themeColor="hyperlink"/>
       <w:u w:val="single"/>

</xml_diff>

<commit_message>
docs: add the guide and team name to the project report and deck
</commit_message>
<xml_diff>
--- a/docs/ShaderMesh-Project-Report.docx
+++ b/docs/ShaderMesh-Project-Report.docx
@@ -29,7 +29,7 @@
     </w:p>
     <w:p>
       <w:pPr>
-        <w:spacing w:after="120"/>
+        <w:spacing w:after="40"/>
         <w:jc w:val="center"/>
       </w:pPr>
       <w:r>
@@ -38,6 +38,19 @@
           <w:sz w:val="26"/>
         </w:rPr>
         <w:t>Submitted by</w:t>
+      </w:r>
+    </w:p>
+    <w:p>
+      <w:pPr>
+        <w:spacing w:after="120" w:line="276" w:lineRule="auto"/>
+        <w:jc w:val="center"/>
+      </w:pPr>
+      <w:r>
+        <w:rPr>
+          <w:b/>
+          <w:sz w:val="26"/>
+        </w:rPr>
+        <w:t>Team teamNinja()</w:t>
       </w:r>
     </w:p>
     <w:tbl>
@@ -194,7 +207,7 @@
         <w:rPr>
           <w:i/>
         </w:rPr>
-        <w:t>Under the guidance of [GUIDE NAME], [GUIDE DESIGNATION]</w:t>
+        <w:t>Under the guidance of Prof. Varunkumar Anantharaman</w:t>
       </w:r>
     </w:p>
     <w:p>
@@ -207,7 +220,7 @@
           <w:noProof/>
         </w:rPr>
         <w:drawing>
-          <wp:inline distT="0" distB="0" distL="0" distR="0" wp14:anchorId="5DCBD8AA" wp14:editId="7043CA9F">
+          <wp:inline distT="0" distB="0" distL="0" distR="0" wp14:anchorId="3066C11A" wp14:editId="710AC8F3">
             <wp:extent cx="2160000" cy="667349"/>
             <wp:effectExtent l="0" t="0" r="0" b="0"/>
             <wp:docPr id="1" name="Picture 1"/>
@@ -318,7 +331,7 @@
       <w:r>
         <w:fldChar w:fldCharType="separate"/>
       </w:r>
-      <w:hyperlink w:anchor="_Toc244039472" w:history="1">
+      <w:hyperlink w:anchor="_Toc244040706" w:history="1">
         <w:r>
           <w:rPr>
             <w:rStyle w:val="Hyperlink"/>
@@ -345,7 +358,7 @@
             <w:noProof/>
             <w:webHidden/>
           </w:rPr>
-          <w:instrText xml:space="preserve"> PAGEREF _Toc244039472 \h </w:instrText>
+          <w:instrText xml:space="preserve"> PAGEREF _Toc244040706 \h </w:instrText>
         </w:r>
         <w:r>
           <w:rPr>
@@ -390,7 +403,7 @@
           <w14:ligatures w14:val="standardContextual"/>
         </w:rPr>
       </w:pPr>
-      <w:hyperlink w:anchor="_Toc244039473" w:history="1">
+      <w:hyperlink w:anchor="_Toc244040707" w:history="1">
         <w:r>
           <w:rPr>
             <w:rStyle w:val="Hyperlink"/>
@@ -417,7 +430,7 @@
             <w:noProof/>
             <w:webHidden/>
           </w:rPr>
-          <w:instrText xml:space="preserve"> PAGEREF _Toc244039473 \h </w:instrText>
+          <w:instrText xml:space="preserve"> PAGEREF _Toc244040707 \h </w:instrText>
         </w:r>
         <w:r>
           <w:rPr>
@@ -462,7 +475,7 @@
           <w14:ligatures w14:val="standardContextual"/>
         </w:rPr>
       </w:pPr>
-      <w:hyperlink w:anchor="_Toc244039474" w:history="1">
+      <w:hyperlink w:anchor="_Toc244040708" w:history="1">
         <w:r>
           <w:rPr>
             <w:rStyle w:val="Hyperlink"/>
@@ -489,7 +502,7 @@
             <w:noProof/>
             <w:webHidden/>
           </w:rPr>
-          <w:instrText xml:space="preserve"> PAGEREF _Toc244039474 \h </w:instrText>
+          <w:instrText xml:space="preserve"> PAGEREF _Toc244040708 \h </w:instrText>
         </w:r>
         <w:r>
           <w:rPr>
@@ -534,7 +547,7 @@
           <w14:ligatures w14:val="standardContextual"/>
         </w:rPr>
       </w:pPr>
-      <w:hyperlink w:anchor="_Toc244039475" w:history="1">
+      <w:hyperlink w:anchor="_Toc244040709" w:history="1">
         <w:r>
           <w:rPr>
             <w:rStyle w:val="Hyperlink"/>
@@ -561,7 +574,7 @@
             <w:noProof/>
             <w:webHidden/>
           </w:rPr>
-          <w:instrText xml:space="preserve"> PAGEREF _Toc244039475 \h </w:instrText>
+          <w:instrText xml:space="preserve"> PAGEREF _Toc244040709 \h </w:instrText>
         </w:r>
         <w:r>
           <w:rPr>
@@ -606,7 +619,7 @@
           <w14:ligatures w14:val="standardContextual"/>
         </w:rPr>
       </w:pPr>
-      <w:hyperlink w:anchor="_Toc244039476" w:history="1">
+      <w:hyperlink w:anchor="_Toc244040710" w:history="1">
         <w:r>
           <w:rPr>
             <w:rStyle w:val="Hyperlink"/>
@@ -633,7 +646,7 @@
             <w:noProof/>
             <w:webHidden/>
           </w:rPr>
-          <w:instrText xml:space="preserve"> PAGEREF _Toc244039476 \h </w:instrText>
+          <w:instrText xml:space="preserve"> PAGEREF _Toc244040710 \h </w:instrText>
         </w:r>
         <w:r>
           <w:rPr>
@@ -678,7 +691,7 @@
           <w14:ligatures w14:val="standardContextual"/>
         </w:rPr>
       </w:pPr>
-      <w:hyperlink w:anchor="_Toc244039477" w:history="1">
+      <w:hyperlink w:anchor="_Toc244040711" w:history="1">
         <w:r>
           <w:rPr>
             <w:rStyle w:val="Hyperlink"/>
@@ -705,7 +718,7 @@
             <w:noProof/>
             <w:webHidden/>
           </w:rPr>
-          <w:instrText xml:space="preserve"> PAGEREF _Toc244039477 \h </w:instrText>
+          <w:instrText xml:space="preserve"> PAGEREF _Toc244040711 \h </w:instrText>
         </w:r>
         <w:r>
           <w:rPr>
@@ -750,7 +763,7 @@
           <w14:ligatures w14:val="standardContextual"/>
         </w:rPr>
       </w:pPr>
-      <w:hyperlink w:anchor="_Toc244039478" w:history="1">
+      <w:hyperlink w:anchor="_Toc244040712" w:history="1">
         <w:r>
           <w:rPr>
             <w:rStyle w:val="Hyperlink"/>
@@ -777,7 +790,7 @@
             <w:noProof/>
             <w:webHidden/>
           </w:rPr>
-          <w:instrText xml:space="preserve"> PAGEREF _Toc244039478 \h </w:instrText>
+          <w:instrText xml:space="preserve"> PAGEREF _Toc244040712 \h </w:instrText>
         </w:r>
         <w:r>
           <w:rPr>
@@ -822,7 +835,7 @@
           <w14:ligatures w14:val="standardContextual"/>
         </w:rPr>
       </w:pPr>
-      <w:hyperlink w:anchor="_Toc244039479" w:history="1">
+      <w:hyperlink w:anchor="_Toc244040713" w:history="1">
         <w:r>
           <w:rPr>
             <w:rStyle w:val="Hyperlink"/>
@@ -849,7 +862,7 @@
             <w:noProof/>
             <w:webHidden/>
           </w:rPr>
-          <w:instrText xml:space="preserve"> PAGEREF _Toc244039479 \h </w:instrText>
+          <w:instrText xml:space="preserve"> PAGEREF _Toc244040713 \h </w:instrText>
         </w:r>
         <w:r>
           <w:rPr>
@@ -894,7 +907,7 @@
           <w14:ligatures w14:val="standardContextual"/>
         </w:rPr>
       </w:pPr>
-      <w:hyperlink w:anchor="_Toc244039480" w:history="1">
+      <w:hyperlink w:anchor="_Toc244040714" w:history="1">
         <w:r>
           <w:rPr>
             <w:rStyle w:val="Hyperlink"/>
@@ -921,7 +934,7 @@
             <w:noProof/>
             <w:webHidden/>
           </w:rPr>
-          <w:instrText xml:space="preserve"> PAGEREF _Toc244039480 \h </w:instrText>
+          <w:instrText xml:space="preserve"> PAGEREF _Toc244040714 \h </w:instrText>
         </w:r>
         <w:r>
           <w:rPr>
@@ -966,7 +979,7 @@
           <w14:ligatures w14:val="standardContextual"/>
         </w:rPr>
       </w:pPr>
-      <w:hyperlink w:anchor="_Toc244039481" w:history="1">
+      <w:hyperlink w:anchor="_Toc244040715" w:history="1">
         <w:r>
           <w:rPr>
             <w:rStyle w:val="Hyperlink"/>
@@ -993,7 +1006,7 @@
             <w:noProof/>
             <w:webHidden/>
           </w:rPr>
-          <w:instrText xml:space="preserve"> PAGEREF _Toc244039481 \h </w:instrText>
+          <w:instrText xml:space="preserve"> PAGEREF _Toc244040715 \h </w:instrText>
         </w:r>
         <w:r>
           <w:rPr>
@@ -1038,7 +1051,7 @@
           <w14:ligatures w14:val="standardContextual"/>
         </w:rPr>
       </w:pPr>
-      <w:hyperlink w:anchor="_Toc244039482" w:history="1">
+      <w:hyperlink w:anchor="_Toc244040716" w:history="1">
         <w:r>
           <w:rPr>
             <w:rStyle w:val="Hyperlink"/>
@@ -1065,7 +1078,7 @@
             <w:noProof/>
             <w:webHidden/>
           </w:rPr>
-          <w:instrText xml:space="preserve"> PAGEREF _Toc244039482 \h </w:instrText>
+          <w:instrText xml:space="preserve"> PAGEREF _Toc244040716 \h </w:instrText>
         </w:r>
         <w:r>
           <w:rPr>
@@ -1110,7 +1123,7 @@
           <w14:ligatures w14:val="standardContextual"/>
         </w:rPr>
       </w:pPr>
-      <w:hyperlink w:anchor="_Toc244039483" w:history="1">
+      <w:hyperlink w:anchor="_Toc244040717" w:history="1">
         <w:r>
           <w:rPr>
             <w:rStyle w:val="Hyperlink"/>
@@ -1137,7 +1150,7 @@
             <w:noProof/>
             <w:webHidden/>
           </w:rPr>
-          <w:instrText xml:space="preserve"> PAGEREF _Toc244039483 \h </w:instrText>
+          <w:instrText xml:space="preserve"> PAGEREF _Toc244040717 \h </w:instrText>
         </w:r>
         <w:r>
           <w:rPr>
@@ -1182,7 +1195,7 @@
           <w14:ligatures w14:val="standardContextual"/>
         </w:rPr>
       </w:pPr>
-      <w:hyperlink w:anchor="_Toc244039484" w:history="1">
+      <w:hyperlink w:anchor="_Toc244040718" w:history="1">
         <w:r>
           <w:rPr>
             <w:rStyle w:val="Hyperlink"/>
@@ -1209,7 +1222,7 @@
             <w:noProof/>
             <w:webHidden/>
           </w:rPr>
-          <w:instrText xml:space="preserve"> PAGEREF _Toc244039484 \h </w:instrText>
+          <w:instrText xml:space="preserve"> PAGEREF _Toc244040718 \h </w:instrText>
         </w:r>
         <w:r>
           <w:rPr>
@@ -1254,7 +1267,7 @@
           <w14:ligatures w14:val="standardContextual"/>
         </w:rPr>
       </w:pPr>
-      <w:hyperlink w:anchor="_Toc244039485" w:history="1">
+      <w:hyperlink w:anchor="_Toc244040719" w:history="1">
         <w:r>
           <w:rPr>
             <w:rStyle w:val="Hyperlink"/>
@@ -1281,7 +1294,7 @@
             <w:noProof/>
             <w:webHidden/>
           </w:rPr>
-          <w:instrText xml:space="preserve"> PAGEREF _Toc244039485 \h </w:instrText>
+          <w:instrText xml:space="preserve"> PAGEREF _Toc244040719 \h </w:instrText>
         </w:r>
         <w:r>
           <w:rPr>
@@ -1326,7 +1339,7 @@
           <w14:ligatures w14:val="standardContextual"/>
         </w:rPr>
       </w:pPr>
-      <w:hyperlink w:anchor="_Toc244039486" w:history="1">
+      <w:hyperlink w:anchor="_Toc244040720" w:history="1">
         <w:r>
           <w:rPr>
             <w:rStyle w:val="Hyperlink"/>
@@ -1353,7 +1366,7 @@
             <w:noProof/>
             <w:webHidden/>
           </w:rPr>
-          <w:instrText xml:space="preserve"> PAGEREF _Toc244039486 \h </w:instrText>
+          <w:instrText xml:space="preserve"> PAGEREF _Toc244040720 \h </w:instrText>
         </w:r>
         <w:r>
           <w:rPr>
@@ -1398,7 +1411,7 @@
           <w14:ligatures w14:val="standardContextual"/>
         </w:rPr>
       </w:pPr>
-      <w:hyperlink w:anchor="_Toc244039487" w:history="1">
+      <w:hyperlink w:anchor="_Toc244040721" w:history="1">
         <w:r>
           <w:rPr>
             <w:rStyle w:val="Hyperlink"/>
@@ -1425,7 +1438,7 @@
             <w:noProof/>
             <w:webHidden/>
           </w:rPr>
-          <w:instrText xml:space="preserve"> PAGEREF _Toc244039487 \h </w:instrText>
+          <w:instrText xml:space="preserve"> PAGEREF _Toc244040721 \h </w:instrText>
         </w:r>
         <w:r>
           <w:rPr>
@@ -1469,7 +1482,7 @@
         <w:pStyle w:val="Heading1"/>
         <w:pageBreakBefore/>
       </w:pPr>
-      <w:bookmarkStart w:id="0" w:name="_Toc244039472"/>
+      <w:bookmarkStart w:id="0" w:name="_Toc244040706"/>
       <w:r>
         <w:lastRenderedPageBreak/>
         <w:t>1. PROJECT TITLE</w:t>
@@ -1501,7 +1514,7 @@
       <w:pPr>
         <w:pStyle w:val="Heading1"/>
       </w:pPr>
-      <w:bookmarkStart w:id="1" w:name="_Toc244039473"/>
+      <w:bookmarkStart w:id="1" w:name="_Toc244040707"/>
       <w:r>
         <w:t>2. TEAM MEMBERS AND ROLL NUMBERS</w:t>
       </w:r>
@@ -1513,7 +1526,16 @@
         <w:jc w:val="both"/>
       </w:pPr>
       <w:r>
-        <w:t>Table 2.1 lists the team members.</w:t>
+        <w:t xml:space="preserve">Team name: </w:t>
+      </w:r>
+      <w:r>
+        <w:rPr>
+          <w:b/>
+        </w:rPr>
+        <w:t>teamNinja()</w:t>
+      </w:r>
+      <w:r>
+        <w:t>. Table 2.1 lists the team members.</w:t>
       </w:r>
     </w:p>
     <w:p>
@@ -1785,14 +1807,14 @@
         <w:jc w:val="both"/>
       </w:pPr>
       <w:r>
-        <w:t>Guide: [GUIDE NAME], [GUIDE DESIGNATION], School of Computer Science and Engineering, VIT-AP University.</w:t>
+        <w:t>Guide: Prof. Varunkumar Anantharaman, School of Computer Science and Engineering, VIT-AP University.</w:t>
       </w:r>
     </w:p>
     <w:p>
       <w:pPr>
         <w:pStyle w:val="Heading1"/>
       </w:pPr>
-      <w:bookmarkStart w:id="2" w:name="_Toc244039474"/>
+      <w:bookmarkStart w:id="2" w:name="_Toc244040708"/>
       <w:r>
         <w:t>3. PROBLEM STATEMENT</w:t>
       </w:r>
@@ -1911,7 +1933,7 @@
           <w:noProof/>
         </w:rPr>
         <w:drawing>
-          <wp:inline distT="0" distB="0" distL="0" distR="0" wp14:anchorId="73C11FEF" wp14:editId="52F2FC80">
+          <wp:inline distT="0" distB="0" distL="0" distR="0" wp14:anchorId="45CC0F8F" wp14:editId="407DAF66">
             <wp:extent cx="5220000" cy="1706940"/>
             <wp:effectExtent l="0" t="0" r="0" b="0"/>
             <wp:docPr id="2" name="Picture 2"/>
@@ -2078,7 +2100,7 @@
       <w:pPr>
         <w:pStyle w:val="Heading1"/>
       </w:pPr>
-      <w:bookmarkStart w:id="3" w:name="_Toc244039475"/>
+      <w:bookmarkStart w:id="3" w:name="_Toc244040709"/>
       <w:r>
         <w:t>4. OBJECTIVES</w:t>
       </w:r>
@@ -2180,7 +2202,7 @@
       <w:pPr>
         <w:pStyle w:val="Heading1"/>
       </w:pPr>
-      <w:bookmarkStart w:id="4" w:name="_Toc244039476"/>
+      <w:bookmarkStart w:id="4" w:name="_Toc244040710"/>
       <w:r>
         <w:t>5. MOTIVATION AND NEED FOR THE PROJECT</w:t>
       </w:r>
@@ -2290,7 +2312,7 @@
       <w:pPr>
         <w:pStyle w:val="Heading1"/>
       </w:pPr>
-      <w:bookmarkStart w:id="5" w:name="_Toc244039477"/>
+      <w:bookmarkStart w:id="5" w:name="_Toc244040711"/>
       <w:r>
         <w:t>6. LITERATURE SURVEY</w:t>
       </w:r>
@@ -3077,7 +3099,7 @@
       <w:pPr>
         <w:pStyle w:val="Heading1"/>
       </w:pPr>
-      <w:bookmarkStart w:id="6" w:name="_Toc244039478"/>
+      <w:bookmarkStart w:id="6" w:name="_Toc244040712"/>
       <w:r>
         <w:t>7. EXISTING SYSTEM</w:t>
       </w:r>
@@ -3434,7 +3456,7 @@
       <w:pPr>
         <w:pStyle w:val="Heading1"/>
       </w:pPr>
-      <w:bookmarkStart w:id="7" w:name="_Toc244039479"/>
+      <w:bookmarkStart w:id="7" w:name="_Toc244040713"/>
       <w:r>
         <w:t>8. PROPOSED SYSTEM</w:t>
       </w:r>
@@ -3562,7 +3584,7 @@
           <w:noProof/>
         </w:rPr>
         <w:drawing>
-          <wp:inline distT="0" distB="0" distL="0" distR="0" wp14:anchorId="4ECD8AE6" wp14:editId="3E566F93">
+          <wp:inline distT="0" distB="0" distL="0" distR="0" wp14:anchorId="30BEBCB7" wp14:editId="205A7819">
             <wp:extent cx="4731428" cy="2879074"/>
             <wp:effectExtent l="0" t="0" r="0" b="0"/>
             <wp:docPr id="3" name="Picture 3"/>
@@ -3727,7 +3749,7 @@
       <w:pPr>
         <w:pStyle w:val="Heading1"/>
       </w:pPr>
-      <w:bookmarkStart w:id="8" w:name="_Toc244039480"/>
+      <w:bookmarkStart w:id="8" w:name="_Toc244040714"/>
       <w:r>
         <w:t>9. BLOCKCHAIN CONCEPTS USED</w:t>
       </w:r>
@@ -4449,7 +4471,7 @@
       <w:pPr>
         <w:pStyle w:val="Heading1"/>
       </w:pPr>
-      <w:bookmarkStart w:id="9" w:name="_Toc244039481"/>
+      <w:bookmarkStart w:id="9" w:name="_Toc244040715"/>
       <w:r>
         <w:t>10. SYSTEM ARCHITECTURE AND BLOCK DIAGRAM</w:t>
       </w:r>
@@ -4475,7 +4497,7 @@
           <w:noProof/>
         </w:rPr>
         <w:drawing>
-          <wp:inline distT="0" distB="0" distL="0" distR="0" wp14:anchorId="150321F6" wp14:editId="343A9FC0">
+          <wp:inline distT="0" distB="0" distL="0" distR="0" wp14:anchorId="49BE12BA" wp14:editId="1BE13387">
             <wp:extent cx="5220000" cy="3593970"/>
             <wp:effectExtent l="0" t="0" r="0" b="0"/>
             <wp:docPr id="4" name="Picture 4"/>
@@ -4542,7 +4564,7 @@
         </w:rPr>
         <w:lastRenderedPageBreak/>
         <w:drawing>
-          <wp:inline distT="0" distB="0" distL="0" distR="0" wp14:anchorId="480F6A3B" wp14:editId="126B3F57">
+          <wp:inline distT="0" distB="0" distL="0" distR="0" wp14:anchorId="2982803C" wp14:editId="0E7E4E7F">
             <wp:extent cx="5220000" cy="3043260"/>
             <wp:effectExtent l="0" t="0" r="0" b="0"/>
             <wp:docPr id="5" name="Picture 5"/>
@@ -4592,7 +4614,7 @@
       <w:pPr>
         <w:pStyle w:val="Heading1"/>
       </w:pPr>
-      <w:bookmarkStart w:id="10" w:name="_Toc244039482"/>
+      <w:bookmarkStart w:id="10" w:name="_Toc244040716"/>
       <w:r>
         <w:t>11. MODULES</w:t>
       </w:r>
@@ -4618,7 +4640,7 @@
           <w:noProof/>
         </w:rPr>
         <w:drawing>
-          <wp:inline distT="0" distB="0" distL="0" distR="0" wp14:anchorId="3769A148" wp14:editId="6A5D153B">
+          <wp:inline distT="0" distB="0" distL="0" distR="0" wp14:anchorId="1E9629AB" wp14:editId="01C93C33">
             <wp:extent cx="5220000" cy="2275920"/>
             <wp:effectExtent l="0" t="0" r="0" b="0"/>
             <wp:docPr id="6" name="Picture 6"/>
@@ -4955,7 +4977,7 @@
         </w:rPr>
         <w:lastRenderedPageBreak/>
         <w:drawing>
-          <wp:inline distT="0" distB="0" distL="0" distR="0" wp14:anchorId="10045C9E" wp14:editId="1261C742">
+          <wp:inline distT="0" distB="0" distL="0" distR="0" wp14:anchorId="2017110C" wp14:editId="2FF5CCC2">
             <wp:extent cx="4896000" cy="3060000"/>
             <wp:effectExtent l="0" t="0" r="0" b="0"/>
             <wp:docPr id="7" name="Picture 7"/>
@@ -5012,7 +5034,7 @@
           <w:noProof/>
         </w:rPr>
         <w:drawing>
-          <wp:inline distT="0" distB="0" distL="0" distR="0" wp14:anchorId="4C25E8BF" wp14:editId="655EC2F2">
+          <wp:inline distT="0" distB="0" distL="0" distR="0" wp14:anchorId="03BCFF54" wp14:editId="049BEC9F">
             <wp:extent cx="4896000" cy="3060000"/>
             <wp:effectExtent l="0" t="0" r="0" b="0"/>
             <wp:docPr id="8" name="Picture 8"/>
@@ -5062,7 +5084,7 @@
       <w:pPr>
         <w:pStyle w:val="Heading1"/>
       </w:pPr>
-      <w:bookmarkStart w:id="11" w:name="_Toc244039483"/>
+      <w:bookmarkStart w:id="11" w:name="_Toc244040717"/>
       <w:r>
         <w:t>12. TECHNOLOGY STACK</w:t>
       </w:r>
@@ -5089,7 +5111,7 @@
         </w:rPr>
         <w:lastRenderedPageBreak/>
         <w:drawing>
-          <wp:inline distT="0" distB="0" distL="0" distR="0" wp14:anchorId="7F69BCC4" wp14:editId="167B98E7">
+          <wp:inline distT="0" distB="0" distL="0" distR="0" wp14:anchorId="6CD13E97" wp14:editId="325B14DA">
             <wp:extent cx="5220000" cy="2088000"/>
             <wp:effectExtent l="0" t="0" r="0" b="0"/>
             <wp:docPr id="9" name="Picture 9"/>
@@ -5492,7 +5514,7 @@
       <w:pPr>
         <w:pStyle w:val="Heading1"/>
       </w:pPr>
-      <w:bookmarkStart w:id="12" w:name="_Toc244039484"/>
+      <w:bookmarkStart w:id="12" w:name="_Toc244040718"/>
       <w:r>
         <w:t>13. METHODOLOGY AND WORKFLOW</w:t>
       </w:r>
@@ -5527,7 +5549,7 @@
         </w:rPr>
         <w:lastRenderedPageBreak/>
         <w:drawing>
-          <wp:inline distT="0" distB="0" distL="0" distR="0" wp14:anchorId="1EA58666" wp14:editId="4F21BE89">
+          <wp:inline distT="0" distB="0" distL="0" distR="0" wp14:anchorId="6B3BBB8C" wp14:editId="6D96C738">
             <wp:extent cx="5220000" cy="1242360"/>
             <wp:effectExtent l="0" t="0" r="0" b="0"/>
             <wp:docPr id="10" name="Picture 10"/>
@@ -5708,7 +5730,7 @@
         </w:rPr>
         <w:lastRenderedPageBreak/>
         <w:drawing>
-          <wp:inline distT="0" distB="0" distL="0" distR="0" wp14:anchorId="5C97728C" wp14:editId="39124A76">
+          <wp:inline distT="0" distB="0" distL="0" distR="0" wp14:anchorId="4C6595C5" wp14:editId="702F8C17">
             <wp:extent cx="4101428" cy="3959929"/>
             <wp:effectExtent l="0" t="0" r="0" b="0"/>
             <wp:docPr id="11" name="Picture 11"/>
@@ -5782,7 +5804,7 @@
           <w:noProof/>
         </w:rPr>
         <w:drawing>
-          <wp:inline distT="0" distB="0" distL="0" distR="0" wp14:anchorId="0DBF7666" wp14:editId="052DDF41">
+          <wp:inline distT="0" distB="0" distL="0" distR="0" wp14:anchorId="6B1E5347" wp14:editId="056DADA1">
             <wp:extent cx="5165999" cy="2518425"/>
             <wp:effectExtent l="0" t="0" r="0" b="0"/>
             <wp:docPr id="12" name="Picture 12"/>
@@ -5832,7 +5854,7 @@
       <w:pPr>
         <w:pStyle w:val="Heading1"/>
       </w:pPr>
-      <w:bookmarkStart w:id="13" w:name="_Toc244039485"/>
+      <w:bookmarkStart w:id="13" w:name="_Toc244040719"/>
       <w:r>
         <w:lastRenderedPageBreak/>
         <w:t>14. DATASET AND INPUT DETAILS</w:t>
@@ -6286,7 +6308,7 @@
       <w:pPr>
         <w:pStyle w:val="Heading1"/>
       </w:pPr>
-      <w:bookmarkStart w:id="14" w:name="_Toc244039486"/>
+      <w:bookmarkStart w:id="14" w:name="_Toc244040720"/>
       <w:r>
         <w:t>15. EXPECTED OUTCOMES</w:t>
       </w:r>
@@ -7127,7 +7149,7 @@
           <w:noProof/>
         </w:rPr>
         <w:drawing>
-          <wp:inline distT="0" distB="0" distL="0" distR="0" wp14:anchorId="4BDA7CEE" wp14:editId="17F798C5">
+          <wp:inline distT="0" distB="0" distL="0" distR="0" wp14:anchorId="5BAA9D14" wp14:editId="3B58ECD2">
             <wp:extent cx="5120689" cy="2698603"/>
             <wp:effectExtent l="0" t="0" r="0" b="0"/>
             <wp:docPr id="13" name="Picture 13"/>
@@ -7186,7 +7208,7 @@
       <w:pPr>
         <w:pStyle w:val="Heading1"/>
       </w:pPr>
-      <w:bookmarkStart w:id="15" w:name="_Toc244039487"/>
+      <w:bookmarkStart w:id="15" w:name="_Toc244040721"/>
       <w:r>
         <w:lastRenderedPageBreak/>
         <w:t>16. REFERENCES</w:t>
@@ -8025,31 +8047,31 @@
       </w:rPr>
     </w:lvl>
   </w:abstractNum>
-  <w:num w:numId="1" w16cid:durableId="1804807557">
+  <w:num w:numId="1" w16cid:durableId="1968732119">
     <w:abstractNumId w:val="8"/>
   </w:num>
-  <w:num w:numId="2" w16cid:durableId="275910081">
+  <w:num w:numId="2" w16cid:durableId="342829552">
     <w:abstractNumId w:val="6"/>
   </w:num>
-  <w:num w:numId="3" w16cid:durableId="1135877647">
+  <w:num w:numId="3" w16cid:durableId="465703976">
     <w:abstractNumId w:val="5"/>
   </w:num>
-  <w:num w:numId="4" w16cid:durableId="1323892863">
+  <w:num w:numId="4" w16cid:durableId="1441949338">
     <w:abstractNumId w:val="4"/>
   </w:num>
-  <w:num w:numId="5" w16cid:durableId="1704591452">
+  <w:num w:numId="5" w16cid:durableId="1415542519">
     <w:abstractNumId w:val="7"/>
   </w:num>
-  <w:num w:numId="6" w16cid:durableId="131212181">
+  <w:num w:numId="6" w16cid:durableId="953098721">
     <w:abstractNumId w:val="3"/>
   </w:num>
-  <w:num w:numId="7" w16cid:durableId="930312065">
+  <w:num w:numId="7" w16cid:durableId="1600020284">
     <w:abstractNumId w:val="2"/>
   </w:num>
-  <w:num w:numId="8" w16cid:durableId="2059278671">
+  <w:num w:numId="8" w16cid:durableId="801071391">
     <w:abstractNumId w:val="1"/>
   </w:num>
-  <w:num w:numId="9" w16cid:durableId="1847288587">
+  <w:num w:numId="9" w16cid:durableId="620497361">
     <w:abstractNumId w:val="0"/>
   </w:num>
 </w:numbering>
@@ -19462,7 +19484,7 @@
     <w:autoRedefine/>
     <w:uiPriority w:val="39"/>
     <w:unhideWhenUsed/>
-    <w:rsid w:val="007D0309"/>
+    <w:rsid w:val="00FE0E98"/>
     <w:pPr>
       <w:spacing w:after="100"/>
     </w:pPr>
@@ -19472,7 +19494,7 @@
     <w:basedOn w:val="DefaultParagraphFont"/>
     <w:uiPriority w:val="99"/>
     <w:unhideWhenUsed/>
-    <w:rsid w:val="007D0309"/>
+    <w:rsid w:val="00FE0E98"/>
     <w:rPr>
       <w:color w:val="0000FF" w:themeColor="hyperlink"/>
       <w:u w:val="single"/>

</xml_diff>